<commit_message>
change the struct of the documents
</commit_message>
<xml_diff>
--- a/docs/2026人工智能创意赛（鸿蒙赛道）作品说明文档-Beat-Per-Mile跑步电台.docx
+++ b/docs/2026人工智能创意赛（鸿蒙赛道）作品说明文档-Beat-Per-Mile跑步电台.docx
@@ -919,6 +919,7 @@
         <w:tc>
           <w:tcPr>
             <w:tcW w:w="1134" w:type="dxa"/>
+            <w:vAlign w:val="center"/>
           </w:tcPr>
           <w:p>
             <w:pPr>
@@ -1019,6 +1020,7 @@
             <w:tcBorders>
               <w:right w:val="single" w:sz="4" w:space="0" w:color="auto"/>
             </w:tcBorders>
+            <w:vAlign w:val="center"/>
           </w:tcPr>
           <w:p>
             <w:pPr>
@@ -1046,6 +1048,7 @@
             <w:tcBorders>
               <w:right w:val="single" w:sz="4" w:space="0" w:color="auto"/>
             </w:tcBorders>
+            <w:vAlign w:val="center"/>
           </w:tcPr>
           <w:p>
             <w:pPr>
@@ -1072,6 +1075,7 @@
             <w:tcBorders>
               <w:left w:val="single" w:sz="4" w:space="0" w:color="auto"/>
             </w:tcBorders>
+            <w:vAlign w:val="center"/>
           </w:tcPr>
           <w:p>
             <w:pPr>
@@ -1098,6 +1102,7 @@
             <w:tcBorders>
               <w:left w:val="single" w:sz="4" w:space="0" w:color="auto"/>
             </w:tcBorders>
+            <w:vAlign w:val="center"/>
           </w:tcPr>
           <w:p>
             <w:pPr>
@@ -1150,6 +1155,7 @@
         <w:tc>
           <w:tcPr>
             <w:tcW w:w="1134" w:type="dxa"/>
+            <w:vAlign w:val="center"/>
           </w:tcPr>
           <w:p>
             <w:pPr>
@@ -1250,6 +1256,7 @@
             <w:tcBorders>
               <w:right w:val="single" w:sz="4" w:space="0" w:color="auto"/>
             </w:tcBorders>
+            <w:vAlign w:val="center"/>
           </w:tcPr>
           <w:p>
             <w:pPr>
@@ -1277,6 +1284,7 @@
             <w:tcBorders>
               <w:right w:val="single" w:sz="4" w:space="0" w:color="auto"/>
             </w:tcBorders>
+            <w:vAlign w:val="center"/>
           </w:tcPr>
           <w:p>
             <w:pPr>
@@ -1303,6 +1311,7 @@
             <w:tcBorders>
               <w:left w:val="single" w:sz="4" w:space="0" w:color="auto"/>
             </w:tcBorders>
+            <w:vAlign w:val="center"/>
           </w:tcPr>
           <w:p>
             <w:pPr>
@@ -1329,6 +1338,7 @@
             <w:tcBorders>
               <w:left w:val="single" w:sz="4" w:space="0" w:color="auto"/>
             </w:tcBorders>
+            <w:vAlign w:val="center"/>
           </w:tcPr>
           <w:p>
             <w:pPr>
@@ -1381,6 +1391,7 @@
         <w:tc>
           <w:tcPr>
             <w:tcW w:w="1134" w:type="dxa"/>
+            <w:vAlign w:val="center"/>
           </w:tcPr>
           <w:p>
             <w:pPr>
@@ -1497,6 +1508,7 @@
             <w:tcBorders>
               <w:right w:val="single" w:sz="4" w:space="0" w:color="auto"/>
             </w:tcBorders>
+            <w:vAlign w:val="center"/>
           </w:tcPr>
           <w:p>
             <w:pPr>
@@ -1524,6 +1536,7 @@
             <w:tcBorders>
               <w:right w:val="single" w:sz="4" w:space="0" w:color="auto"/>
             </w:tcBorders>
+            <w:vAlign w:val="center"/>
           </w:tcPr>
           <w:p>
             <w:pPr>
@@ -1550,6 +1563,7 @@
             <w:tcBorders>
               <w:left w:val="single" w:sz="4" w:space="0" w:color="auto"/>
             </w:tcBorders>
+            <w:vAlign w:val="center"/>
           </w:tcPr>
           <w:p>
             <w:pPr>
@@ -1576,6 +1590,7 @@
             <w:tcBorders>
               <w:left w:val="single" w:sz="4" w:space="0" w:color="auto"/>
             </w:tcBorders>
+            <w:vAlign w:val="center"/>
           </w:tcPr>
           <w:p>
             <w:pPr>
@@ -1859,6 +1874,7 @@
           <w:tcPr>
             <w:tcW w:w="1426" w:type="dxa"/>
             <w:gridSpan w:val="2"/>
+            <w:vAlign w:val="center"/>
           </w:tcPr>
           <w:p>
             <w:pPr>
@@ -1872,6 +1888,7 @@
             <w:r>
               <w:rPr>
                 <w:rFonts w:ascii="宋体" w:eastAsia="宋体" w:hAnsi="宋体" w:hint="eastAsia"/>
+                <w:color w:val="808080" w:themeColor="background1" w:themeShade="80"/>
                 <w:szCs w:val="21"/>
               </w:rPr>
               <w:t>讲师</w:t>
@@ -1907,6 +1924,7 @@
           <w:tcPr>
             <w:tcW w:w="1122" w:type="dxa"/>
             <w:gridSpan w:val="2"/>
+            <w:vAlign w:val="center"/>
           </w:tcPr>
           <w:p>
             <w:pPr>
@@ -1931,6 +1949,7 @@
           <w:tcPr>
             <w:tcW w:w="2264" w:type="dxa"/>
             <w:gridSpan w:val="3"/>
+            <w:vAlign w:val="center"/>
           </w:tcPr>
           <w:p>
             <w:pPr>
@@ -2191,10 +2210,138 @@
       </w:pPr>
       <w:r>
         <w:rPr>
-          <w:rFonts w:ascii="宋体" w:eastAsia="宋体" w:hAnsi="宋体" w:hint="eastAsia"/>
-          <w:szCs w:val="21"/>
-        </w:rPr>
-        <w:t>【预留位：此处插入三位队员的电子签名图片】</w:t>
+          <w:rFonts w:ascii="宋体" w:eastAsia="宋体" w:hAnsi="宋体" w:cs="宋体"/>
+          <w:noProof/>
+          <w:sz w:val="24"/>
+          <w:szCs w:val="24"/>
+        </w:rPr>
+        <w:drawing>
+          <wp:inline distT="0" distB="0" distL="114300" distR="114300" wp14:anchorId="378F12BB" wp14:editId="06CE66DB">
+            <wp:extent cx="1570355" cy="656590"/>
+            <wp:effectExtent l="0" t="0" r="10795" b="10160"/>
+            <wp:docPr id="7" name="图片 7"/>
+            <wp:cNvGraphicFramePr>
+              <a:graphicFrameLocks xmlns:a="http://schemas.openxmlformats.org/drawingml/2006/main" noChangeAspect="1"/>
+            </wp:cNvGraphicFramePr>
+            <a:graphic xmlns:a="http://schemas.openxmlformats.org/drawingml/2006/main">
+              <a:graphicData uri="http://schemas.openxmlformats.org/drawingml/2006/picture">
+                <pic:pic xmlns:pic="http://schemas.openxmlformats.org/drawingml/2006/picture">
+                  <pic:nvPicPr>
+                    <pic:cNvPr id="7" name="图片 7"/>
+                    <pic:cNvPicPr>
+                      <a:picLocks noChangeAspect="1"/>
+                    </pic:cNvPicPr>
+                  </pic:nvPicPr>
+                  <pic:blipFill>
+                    <a:blip r:embed="rId8"/>
+                    <a:stretch>
+                      <a:fillRect/>
+                    </a:stretch>
+                  </pic:blipFill>
+                  <pic:spPr>
+                    <a:xfrm>
+                      <a:off x="0" y="0"/>
+                      <a:ext cx="1570355" cy="656590"/>
+                    </a:xfrm>
+                    <a:prstGeom prst="rect">
+                      <a:avLst/>
+                    </a:prstGeom>
+                  </pic:spPr>
+                </pic:pic>
+              </a:graphicData>
+            </a:graphic>
+          </wp:inline>
+        </w:drawing>
+      </w:r>
+      <w:r>
+        <w:rPr>
+          <w:rFonts w:ascii="宋体" w:eastAsia="宋体" w:hAnsi="宋体" w:cs="宋体"/>
+          <w:noProof/>
+          <w:sz w:val="24"/>
+          <w:szCs w:val="24"/>
+        </w:rPr>
+        <w:drawing>
+          <wp:inline distT="0" distB="0" distL="114300" distR="114300" wp14:anchorId="03AF2F50" wp14:editId="72B6B513">
+            <wp:extent cx="1807210" cy="861695"/>
+            <wp:effectExtent l="0" t="0" r="2540" b="14605"/>
+            <wp:docPr id="8" name="图片 8"/>
+            <wp:cNvGraphicFramePr>
+              <a:graphicFrameLocks xmlns:a="http://schemas.openxmlformats.org/drawingml/2006/main" noChangeAspect="1"/>
+            </wp:cNvGraphicFramePr>
+            <a:graphic xmlns:a="http://schemas.openxmlformats.org/drawingml/2006/main">
+              <a:graphicData uri="http://schemas.openxmlformats.org/drawingml/2006/picture">
+                <pic:pic xmlns:pic="http://schemas.openxmlformats.org/drawingml/2006/picture">
+                  <pic:nvPicPr>
+                    <pic:cNvPr id="8" name="图片 8"/>
+                    <pic:cNvPicPr>
+                      <a:picLocks noChangeAspect="1"/>
+                    </pic:cNvPicPr>
+                  </pic:nvPicPr>
+                  <pic:blipFill>
+                    <a:blip r:embed="rId9"/>
+                    <a:stretch>
+                      <a:fillRect/>
+                    </a:stretch>
+                  </pic:blipFill>
+                  <pic:spPr>
+                    <a:xfrm>
+                      <a:off x="0" y="0"/>
+                      <a:ext cx="1807210" cy="861695"/>
+                    </a:xfrm>
+                    <a:prstGeom prst="rect">
+                      <a:avLst/>
+                    </a:prstGeom>
+                  </pic:spPr>
+                </pic:pic>
+              </a:graphicData>
+            </a:graphic>
+          </wp:inline>
+        </w:drawing>
+      </w:r>
+      <w:r>
+        <w:rPr>
+          <w:rFonts w:ascii="宋体" w:eastAsia="宋体" w:hAnsi="宋体" w:cs="宋体"/>
+          <w:noProof/>
+          <w:sz w:val="24"/>
+          <w:szCs w:val="24"/>
+        </w:rPr>
+        <w:drawing>
+          <wp:inline distT="0" distB="0" distL="114300" distR="114300" wp14:anchorId="792D45E2" wp14:editId="58DEE93C">
+            <wp:extent cx="1358900" cy="751205"/>
+            <wp:effectExtent l="0" t="0" r="12700" b="10795"/>
+            <wp:docPr id="17" name="图片 17"/>
+            <wp:cNvGraphicFramePr>
+              <a:graphicFrameLocks xmlns:a="http://schemas.openxmlformats.org/drawingml/2006/main" noChangeAspect="1"/>
+            </wp:cNvGraphicFramePr>
+            <a:graphic xmlns:a="http://schemas.openxmlformats.org/drawingml/2006/main">
+              <a:graphicData uri="http://schemas.openxmlformats.org/drawingml/2006/picture">
+                <pic:pic xmlns:pic="http://schemas.openxmlformats.org/drawingml/2006/picture">
+                  <pic:nvPicPr>
+                    <pic:cNvPr id="17" name="图片 17"/>
+                    <pic:cNvPicPr>
+                      <a:picLocks noChangeAspect="1"/>
+                    </pic:cNvPicPr>
+                  </pic:nvPicPr>
+                  <pic:blipFill>
+                    <a:blip r:embed="rId10"/>
+                    <a:stretch>
+                      <a:fillRect/>
+                    </a:stretch>
+                  </pic:blipFill>
+                  <pic:spPr>
+                    <a:xfrm>
+                      <a:off x="0" y="0"/>
+                      <a:ext cx="1358900" cy="751205"/>
+                    </a:xfrm>
+                    <a:prstGeom prst="rect">
+                      <a:avLst/>
+                    </a:prstGeom>
+                  </pic:spPr>
+                </pic:pic>
+              </a:graphicData>
+            </a:graphic>
+          </wp:inline>
+        </w:drawing>
       </w:r>
     </w:p>
     <w:p>
@@ -2206,32 +2353,54 @@
           <w:szCs w:val="21"/>
         </w:rPr>
       </w:pPr>
-    </w:p>
-    <w:p>
-      <w:pPr>
-        <w:adjustRightInd w:val="0"/>
-        <w:snapToGrid w:val="0"/>
-        <w:rPr>
-          <w:rFonts w:ascii="宋体" w:eastAsia="宋体" w:hAnsi="宋体" w:hint="eastAsia"/>
-          <w:szCs w:val="21"/>
-        </w:rPr>
-      </w:pPr>
-    </w:p>
-    <w:p>
-      <w:pPr>
-        <w:adjustRightInd w:val="0"/>
-        <w:snapToGrid w:val="0"/>
-        <w:rPr>
-          <w:rFonts w:ascii="宋体" w:eastAsia="宋体" w:hAnsi="宋体" w:hint="eastAsia"/>
-          <w:szCs w:val="21"/>
-        </w:rPr>
-      </w:pPr>
-      <w:r>
-        <w:rPr>
-          <w:rFonts w:ascii="宋体" w:eastAsia="宋体" w:hAnsi="宋体" w:hint="eastAsia"/>
-          <w:szCs w:val="21"/>
-        </w:rPr>
-        <w:t>日期：      年      月      日</w:t>
+      <w:r>
+        <w:rPr>
+          <w:rFonts w:ascii="宋体" w:eastAsia="宋体" w:hAnsi="宋体" w:hint="eastAsia"/>
+          <w:szCs w:val="21"/>
+        </w:rPr>
+        <w:t>日期：</w:t>
+      </w:r>
+      <w:r>
+        <w:rPr>
+          <w:rFonts w:ascii="宋体" w:eastAsia="宋体" w:hAnsi="宋体" w:hint="eastAsia"/>
+          <w:szCs w:val="21"/>
+        </w:rPr>
+        <w:t>2026</w:t>
+      </w:r>
+      <w:r>
+        <w:rPr>
+          <w:rFonts w:ascii="宋体" w:eastAsia="宋体" w:hAnsi="宋体" w:hint="eastAsia"/>
+          <w:szCs w:val="21"/>
+        </w:rPr>
+        <w:t>年</w:t>
+      </w:r>
+      <w:r>
+        <w:rPr>
+          <w:rFonts w:ascii="宋体" w:eastAsia="宋体" w:hAnsi="宋体" w:hint="eastAsia"/>
+          <w:szCs w:val="21"/>
+        </w:rPr>
+        <w:t>9</w:t>
+      </w:r>
+      <w:r>
+        <w:rPr>
+          <w:rFonts w:ascii="宋体" w:eastAsia="宋体" w:hAnsi="宋体" w:hint="eastAsia"/>
+          <w:szCs w:val="21"/>
+        </w:rPr>
+        <w:t>月</w:t>
+      </w:r>
+      <w:r>
+        <w:rPr>
+          <w:rFonts w:ascii="宋体" w:eastAsia="宋体" w:hAnsi="宋体" w:hint="eastAsia"/>
+          <w:szCs w:val="21"/>
+        </w:rPr>
+        <w:t>28</w:t>
+      </w:r>
+      <w:r>
+        <w:rPr>
+          <w:rFonts w:ascii="宋体" w:eastAsia="宋体" w:hAnsi="宋体" w:hint="eastAsia"/>
+          <w:szCs w:val="21"/>
+        </w:rPr>
+        <w:t>日</w:t>
       </w:r>
     </w:p>
     <w:p>
@@ -2283,10 +2452,44 @@
       </w:pPr>
       <w:r>
         <w:rPr>
-          <w:rFonts w:ascii="宋体" w:eastAsia="宋体" w:hAnsi="宋体" w:hint="eastAsia"/>
-          <w:szCs w:val="21"/>
-        </w:rPr>
-        <w:t>【预留位：此处插入指导老师电子签名图片】</w:t>
+          <w:rFonts w:ascii="宋体" w:eastAsia="宋体" w:hAnsi="宋体"/>
+          <w:szCs w:val="21"/>
+        </w:rPr>
+        <w:drawing>
+          <wp:inline distT="0" distB="0" distL="0" distR="0" wp14:anchorId="47231705" wp14:editId="28370870">
+            <wp:extent cx="1570467" cy="708034"/>
+            <wp:effectExtent l="0" t="0" r="0" b="0"/>
+            <wp:docPr id="1389134174" name="图片 1"/>
+            <wp:cNvGraphicFramePr>
+              <a:graphicFrameLocks xmlns:a="http://schemas.openxmlformats.org/drawingml/2006/main" noChangeAspect="1"/>
+            </wp:cNvGraphicFramePr>
+            <a:graphic xmlns:a="http://schemas.openxmlformats.org/drawingml/2006/main">
+              <a:graphicData uri="http://schemas.openxmlformats.org/drawingml/2006/picture">
+                <pic:pic xmlns:pic="http://schemas.openxmlformats.org/drawingml/2006/picture">
+                  <pic:nvPicPr>
+                    <pic:cNvPr id="1389134174" name=""/>
+                    <pic:cNvPicPr/>
+                  </pic:nvPicPr>
+                  <pic:blipFill>
+                    <a:blip r:embed="rId11"/>
+                    <a:stretch>
+                      <a:fillRect/>
+                    </a:stretch>
+                  </pic:blipFill>
+                  <pic:spPr>
+                    <a:xfrm>
+                      <a:off x="0" y="0"/>
+                      <a:ext cx="1626368" cy="733237"/>
+                    </a:xfrm>
+                    <a:prstGeom prst="rect">
+                      <a:avLst/>
+                    </a:prstGeom>
+                  </pic:spPr>
+                </pic:pic>
+              </a:graphicData>
+            </a:graphic>
+          </wp:inline>
+        </w:drawing>
       </w:r>
     </w:p>
     <w:p>
@@ -2308,22 +2511,47 @@
           <w:szCs w:val="21"/>
         </w:rPr>
       </w:pPr>
-    </w:p>
-    <w:p>
-      <w:pPr>
-        <w:adjustRightInd w:val="0"/>
-        <w:snapToGrid w:val="0"/>
-        <w:rPr>
-          <w:rFonts w:ascii="宋体" w:eastAsia="宋体" w:hAnsi="宋体" w:hint="eastAsia"/>
-          <w:szCs w:val="21"/>
-        </w:rPr>
-      </w:pPr>
-      <w:r>
-        <w:rPr>
-          <w:rFonts w:ascii="宋体" w:eastAsia="宋体" w:hAnsi="宋体" w:hint="eastAsia"/>
-          <w:szCs w:val="21"/>
-        </w:rPr>
-        <w:t>日期：      年      月      日</w:t>
+      <w:r>
+        <w:rPr>
+          <w:rFonts w:ascii="宋体" w:eastAsia="宋体" w:hAnsi="宋体" w:hint="eastAsia"/>
+          <w:szCs w:val="21"/>
+        </w:rPr>
+        <w:t>日期：</w:t>
+      </w:r>
+      <w:r>
+        <w:rPr>
+          <w:rFonts w:ascii="宋体" w:eastAsia="宋体" w:hAnsi="宋体" w:hint="eastAsia"/>
+          <w:szCs w:val="21"/>
+        </w:rPr>
+        <w:t>2026</w:t>
+      </w:r>
+      <w:r>
+        <w:rPr>
+          <w:rFonts w:ascii="宋体" w:eastAsia="宋体" w:hAnsi="宋体" w:hint="eastAsia"/>
+          <w:szCs w:val="21"/>
+        </w:rPr>
+        <w:t>年</w:t>
+      </w:r>
+      <w:r>
+        <w:rPr>
+          <w:rFonts w:ascii="宋体" w:eastAsia="宋体" w:hAnsi="宋体" w:hint="eastAsia"/>
+          <w:szCs w:val="21"/>
+        </w:rPr>
+        <w:t>9</w:t>
+      </w:r>
+      <w:r>
+        <w:rPr>
+          <w:rFonts w:ascii="宋体" w:eastAsia="宋体" w:hAnsi="宋体" w:hint="eastAsia"/>
+          <w:szCs w:val="21"/>
+        </w:rPr>
+        <w:t>月</w:t>
+      </w:r>
+      <w:r>
+        <w:rPr>
+          <w:rFonts w:ascii="宋体" w:eastAsia="宋体" w:hAnsi="宋体" w:hint="eastAsia"/>
+          <w:szCs w:val="21"/>
+        </w:rPr>
+        <w:t>28日</w:t>
       </w:r>
     </w:p>
     <w:p>
@@ -2505,7 +2733,7 @@
         <w:snapToGrid w:val="0"/>
         <w:ind w:firstLine="420"/>
         <w:rPr>
-          <w:rFonts w:ascii="宋体" w:eastAsia="宋体" w:hAnsi="宋体" w:cs="宋体"/>
+          <w:rFonts w:ascii="宋体" w:eastAsia="宋体" w:hAnsi="宋体" w:cs="宋体" w:hint="eastAsia"/>
           <w:szCs w:val="21"/>
           <w:lang w:eastAsia="zh"/>
         </w:rPr>
@@ -2521,10 +2749,6 @@
     </w:p>
     <w:p>
       <w:pPr>
-        <w:keepNext/>
-        <w:adjustRightInd w:val="0"/>
-        <w:snapToGrid w:val="0"/>
-        <w:ind w:firstLine="420"/>
         <w:jc w:val="center"/>
         <w:rPr>
           <w:rFonts w:hint="eastAsia"/>
@@ -2532,11 +2756,7 @@
       </w:pPr>
       <w:r>
         <w:rPr>
-          <w:rFonts w:ascii="宋体" w:eastAsia="宋体" w:hAnsi="宋体" w:cs="宋体"/>
           <w:noProof/>
-          <w:color w:val="7F7F7F" w:themeColor="text1" w:themeTint="80"/>
-          <w:sz w:val="24"/>
-          <w:szCs w:val="24"/>
           <w:lang w:eastAsia="zh"/>
         </w:rPr>
         <w:drawing>
@@ -2557,7 +2777,7 @@
                     </pic:cNvPicPr>
                   </pic:nvPicPr>
                   <pic:blipFill>
-                    <a:blip r:embed="rId8"/>
+                    <a:blip r:embed="rId12"/>
                     <a:stretch>
                       <a:fillRect/>
                     </a:stretch>
@@ -2582,6 +2802,9 @@
       <w:pPr>
         <w:pStyle w:val="ac"/>
         <w:jc w:val="center"/>
+        <w:rPr>
+          <w:rFonts w:hint="eastAsia"/>
+        </w:rPr>
       </w:pPr>
       <w:r>
         <w:rPr>
@@ -2651,7 +2874,13 @@
         <w:t>应用交互流程图</w:t>
       </w:r>
     </w:p>
-    <w:p/>
+    <w:p>
+      <w:pPr>
+        <w:rPr>
+          <w:rFonts w:hint="eastAsia"/>
+        </w:rPr>
+      </w:pPr>
+    </w:p>
     <w:p>
       <w:pPr>
         <w:rPr>
@@ -2679,7 +2908,25 @@
           <w:szCs w:val="24"/>
         </w:rPr>
         <w:lastRenderedPageBreak/>
-        <w:t>（3）应用宣传海报</w:t>
+        <w:t>（</w:t>
+      </w:r>
+      <w:r>
+        <w:rPr>
+          <w:rFonts w:ascii="宋体" w:eastAsia="宋体" w:hAnsi="宋体" w:hint="eastAsia"/>
+          <w:b/>
+          <w:sz w:val="24"/>
+          <w:szCs w:val="24"/>
+        </w:rPr>
+        <w:t>2</w:t>
+      </w:r>
+      <w:r>
+        <w:rPr>
+          <w:rFonts w:ascii="宋体" w:eastAsia="宋体" w:hAnsi="宋体" w:hint="eastAsia"/>
+          <w:b/>
+          <w:sz w:val="24"/>
+          <w:szCs w:val="24"/>
+        </w:rPr>
+        <w:t>）应用宣传海报</w:t>
       </w:r>
     </w:p>
     <w:p>
@@ -2728,27 +2975,7 @@
         <w:ind w:firstLine="420"/>
         <w:jc w:val="left"/>
         <w:rPr>
-          <w:rFonts w:ascii="宋体" w:eastAsia="宋体" w:hAnsi="宋体" w:cs="宋体"/>
-          <w:szCs w:val="21"/>
-          <w:lang w:eastAsia="zh"/>
-        </w:rPr>
-      </w:pPr>
-      <w:r>
-        <w:rPr>
-          <w:rFonts w:ascii="宋体" w:eastAsia="宋体" w:hAnsi="宋体" w:cs="宋体" w:hint="eastAsia"/>
-          <w:szCs w:val="21"/>
-          <w:lang w:eastAsia="zh"/>
-        </w:rPr>
-        <w:t>《Beat-Per-Mile跑步电台》搭载鸿蒙实时音频处理引擎，无损变速算法，只调速度、不改音高，你手机里所有本地歌曲，都能精准适配160-180BPM黄金跑步步频，原声质感丝毫不减。</w:t>
-      </w:r>
-    </w:p>
-    <w:p>
-      <w:pPr>
-        <w:widowControl/>
-        <w:ind w:firstLine="420"/>
-        <w:jc w:val="left"/>
-        <w:rPr>
-          <w:rFonts w:ascii="宋体" w:eastAsia="宋体" w:hAnsi="宋体" w:cs="宋体"/>
+          <w:rFonts w:ascii="宋体" w:eastAsia="宋体" w:hAnsi="宋体" w:cs="宋体" w:hint="eastAsia"/>
           <w:szCs w:val="21"/>
           <w:lang w:eastAsia="zh"/>
         </w:rPr>
@@ -2761,9 +2988,17 @@
           <w:lang w:eastAsia="zh"/>
         </w:rPr>
         <w:drawing>
-          <wp:inline distT="0" distB="0" distL="114300" distR="114300" wp14:anchorId="59CC9380" wp14:editId="7884585F">
-            <wp:extent cx="5092071" cy="7202816"/>
-            <wp:effectExtent l="0" t="0" r="0" b="0"/>
+          <wp:anchor distT="0" distB="0" distL="114300" distR="114300" simplePos="0" relativeHeight="251659264" behindDoc="0" locked="0" layoutInCell="1" allowOverlap="1" wp14:anchorId="59CC9380" wp14:editId="2380E967">
+            <wp:simplePos x="0" y="0"/>
+            <wp:positionH relativeFrom="column">
+              <wp:posOffset>120650</wp:posOffset>
+            </wp:positionH>
+            <wp:positionV relativeFrom="paragraph">
+              <wp:posOffset>641985</wp:posOffset>
+            </wp:positionV>
+            <wp:extent cx="4923790" cy="6965315"/>
+            <wp:effectExtent l="0" t="0" r="0" b="6985"/>
+            <wp:wrapSquare wrapText="bothSides"/>
             <wp:docPr id="14" name="图片 14"/>
             <wp:cNvGraphicFramePr>
               <a:graphicFrameLocks xmlns:a="http://schemas.openxmlformats.org/drawingml/2006/main" noChangeAspect="1"/>
@@ -2778,7 +3013,7 @@
                     </pic:cNvPicPr>
                   </pic:nvPicPr>
                   <pic:blipFill>
-                    <a:blip r:embed="rId9"/>
+                    <a:blip r:embed="rId13"/>
                     <a:stretch>
                       <a:fillRect/>
                     </a:stretch>
@@ -2786,7 +3021,7 @@
                   <pic:spPr>
                     <a:xfrm>
                       <a:off x="0" y="0"/>
-                      <a:ext cx="5117649" cy="7238996"/>
+                      <a:ext cx="4923790" cy="6965315"/>
                     </a:xfrm>
                     <a:prstGeom prst="rect">
                       <a:avLst/>
@@ -2795,33 +3030,136 @@
                 </pic:pic>
               </a:graphicData>
             </a:graphic>
-          </wp:inline>
+            <wp14:sizeRelH relativeFrom="margin">
+              <wp14:pctWidth>0</wp14:pctWidth>
+            </wp14:sizeRelH>
+            <wp14:sizeRelV relativeFrom="margin">
+              <wp14:pctHeight>0</wp14:pctHeight>
+            </wp14:sizeRelV>
+          </wp:anchor>
         </w:drawing>
       </w:r>
-    </w:p>
-    <w:p>
-      <w:pPr>
-        <w:widowControl/>
-        <w:ind w:firstLine="420"/>
-        <w:jc w:val="left"/>
-        <w:rPr>
-          <w:rFonts w:ascii="宋体" w:eastAsia="宋体" w:hAnsi="宋体" w:cs="宋体" w:hint="eastAsia"/>
-          <w:szCs w:val="21"/>
-          <w:lang w:eastAsia="zh"/>
-        </w:rPr>
-      </w:pPr>
-      <w:r>
-        <w:rPr>
-          <w:rFonts w:ascii="宋体" w:eastAsia="宋体" w:hAnsi="宋体" w:cs="宋体" w:hint="eastAsia"/>
+      <w:r>
+        <w:rPr>
+          <w:rFonts w:ascii="宋体" w:eastAsia="宋体" w:hAnsi="宋体" w:cs="宋体" w:hint="eastAsia"/>
+          <w:szCs w:val="21"/>
+          <w:lang w:eastAsia="zh"/>
+        </w:rPr>
+        <w:t>《Beat-Per-Mile跑步电台》搭载鸿蒙实时音频处理引擎，无损变速算法，只调速度、不改音高，你手机里所有本地歌曲，都能精准适配160-180BPM黄金跑步步频，原声质感丝毫不减。</w:t>
+      </w:r>
+    </w:p>
+    <w:p>
+      <w:pPr>
+        <w:pStyle w:val="ac"/>
+        <w:jc w:val="center"/>
+        <w:rPr>
+          <w:rFonts w:ascii="宋体" w:hAnsi="宋体" w:cs="宋体" w:hint="eastAsia"/>
+          <w:szCs w:val="18"/>
+          <w:lang w:eastAsia="zh"/>
+        </w:rPr>
+      </w:pPr>
+      <w:r>
+        <w:rPr>
+          <w:rFonts w:hint="eastAsia"/>
+        </w:rPr>
+        <w:t>图</w:t>
+      </w:r>
+      <w:r>
+        <w:rPr>
+          <w:rFonts w:hint="eastAsia"/>
+        </w:rPr>
+        <w:t xml:space="preserve"> </w:t>
+      </w:r>
+      <w:r>
+        <w:rPr>
+          <w:rFonts w:hint="eastAsia"/>
+        </w:rPr>
+        <w:fldChar w:fldCharType="begin"/>
+      </w:r>
+      <w:r>
+        <w:rPr>
+          <w:rFonts w:hint="eastAsia"/>
+        </w:rPr>
+        <w:instrText xml:space="preserve"> SEQ </w:instrText>
+      </w:r>
+      <w:r>
+        <w:rPr>
+          <w:rFonts w:hint="eastAsia"/>
+        </w:rPr>
+        <w:instrText>图</w:instrText>
+      </w:r>
+      <w:r>
+        <w:rPr>
+          <w:rFonts w:hint="eastAsia"/>
+        </w:rPr>
+        <w:instrText xml:space="preserve"> \* ARABIC </w:instrText>
+      </w:r>
+      <w:r>
+        <w:rPr>
+          <w:rFonts w:hint="eastAsia"/>
+        </w:rPr>
+        <w:fldChar w:fldCharType="separate"/>
+      </w:r>
+      <w:r>
+        <w:rPr>
+          <w:rFonts w:hint="eastAsia"/>
+          <w:noProof/>
+        </w:rPr>
+        <w:t>2</w:t>
+      </w:r>
+      <w:r>
+        <w:rPr>
+          <w:rFonts w:hint="eastAsia"/>
+        </w:rPr>
+        <w:fldChar w:fldCharType="end"/>
+      </w:r>
+      <w:r>
+        <w:rPr>
+          <w:rFonts w:hint="eastAsia"/>
+        </w:rPr>
+        <w:t xml:space="preserve"> </w:t>
+      </w:r>
+      <w:r>
+        <w:rPr>
+          <w:rFonts w:hint="eastAsia"/>
+        </w:rPr>
+        <w:t>应用宣传海报</w:t>
+      </w:r>
+      <w:r>
+        <w:rPr>
+          <w:rFonts w:hint="eastAsia"/>
+        </w:rPr>
+        <w:t>-1</w:t>
+      </w:r>
+    </w:p>
+    <w:p>
+      <w:pPr>
+        <w:pStyle w:val="ac"/>
+        <w:jc w:val="center"/>
+        <w:rPr>
+          <w:rFonts w:hint="eastAsia"/>
+        </w:rPr>
+      </w:pPr>
+      <w:r>
+        <w:rPr>
+          <w:rFonts w:ascii="宋体" w:hAnsi="宋体" w:cs="宋体" w:hint="eastAsia"/>
           <w:noProof/>
           <w:szCs w:val="21"/>
           <w:lang w:eastAsia="zh"/>
         </w:rPr>
         <w:lastRenderedPageBreak/>
         <w:drawing>
-          <wp:inline distT="0" distB="0" distL="114300" distR="114300" wp14:anchorId="474C792E" wp14:editId="4C1FCB3D">
-            <wp:extent cx="5270093" cy="7454632"/>
-            <wp:effectExtent l="0" t="0" r="6985" b="0"/>
+          <wp:anchor distT="0" distB="0" distL="114300" distR="114300" simplePos="0" relativeHeight="251658240" behindDoc="0" locked="0" layoutInCell="1" allowOverlap="1" wp14:anchorId="474C792E" wp14:editId="522704D8">
+            <wp:simplePos x="0" y="0"/>
+            <wp:positionH relativeFrom="column">
+              <wp:posOffset>192405</wp:posOffset>
+            </wp:positionH>
+            <wp:positionV relativeFrom="paragraph">
+              <wp:posOffset>112899</wp:posOffset>
+            </wp:positionV>
+            <wp:extent cx="5188585" cy="7339965"/>
+            <wp:effectExtent l="0" t="0" r="0" b="0"/>
+            <wp:wrapSquare wrapText="bothSides"/>
             <wp:docPr id="12" name="图片 12"/>
             <wp:cNvGraphicFramePr>
               <a:graphicFrameLocks xmlns:a="http://schemas.openxmlformats.org/drawingml/2006/main" noChangeAspect="1"/>
@@ -2836,7 +3174,137 @@
                     </pic:cNvPicPr>
                   </pic:nvPicPr>
                   <pic:blipFill>
-                    <a:blip r:embed="rId10"/>
+                    <a:blip r:embed="rId14"/>
+                    <a:stretch>
+                      <a:fillRect/>
+                    </a:stretch>
+                  </pic:blipFill>
+                  <pic:spPr>
+                    <a:xfrm>
+                      <a:off x="0" y="0"/>
+                      <a:ext cx="5188585" cy="7339965"/>
+                    </a:xfrm>
+                    <a:prstGeom prst="rect">
+                      <a:avLst/>
+                    </a:prstGeom>
+                  </pic:spPr>
+                </pic:pic>
+              </a:graphicData>
+            </a:graphic>
+            <wp14:sizeRelH relativeFrom="margin">
+              <wp14:pctWidth>0</wp14:pctWidth>
+            </wp14:sizeRelH>
+            <wp14:sizeRelV relativeFrom="margin">
+              <wp14:pctHeight>0</wp14:pctHeight>
+            </wp14:sizeRelV>
+          </wp:anchor>
+        </w:drawing>
+      </w:r>
+      <w:r>
+        <w:rPr>
+          <w:rFonts w:hint="eastAsia"/>
+        </w:rPr>
+        <w:t>图</w:t>
+      </w:r>
+      <w:r>
+        <w:rPr>
+          <w:rFonts w:hint="eastAsia"/>
+        </w:rPr>
+        <w:t xml:space="preserve"> </w:t>
+      </w:r>
+      <w:r>
+        <w:rPr>
+          <w:rFonts w:hint="eastAsia"/>
+        </w:rPr>
+        <w:fldChar w:fldCharType="begin"/>
+      </w:r>
+      <w:r>
+        <w:rPr>
+          <w:rFonts w:hint="eastAsia"/>
+        </w:rPr>
+        <w:instrText xml:space="preserve"> SEQ </w:instrText>
+      </w:r>
+      <w:r>
+        <w:rPr>
+          <w:rFonts w:hint="eastAsia"/>
+        </w:rPr>
+        <w:instrText>图</w:instrText>
+      </w:r>
+      <w:r>
+        <w:rPr>
+          <w:rFonts w:hint="eastAsia"/>
+        </w:rPr>
+        <w:instrText xml:space="preserve"> \* ARABIC </w:instrText>
+      </w:r>
+      <w:r>
+        <w:rPr>
+          <w:rFonts w:hint="eastAsia"/>
+        </w:rPr>
+        <w:fldChar w:fldCharType="separate"/>
+      </w:r>
+      <w:r>
+        <w:rPr>
+          <w:rFonts w:hint="eastAsia"/>
+          <w:noProof/>
+        </w:rPr>
+        <w:t>3</w:t>
+      </w:r>
+      <w:r>
+        <w:rPr>
+          <w:rFonts w:hint="eastAsia"/>
+        </w:rPr>
+        <w:fldChar w:fldCharType="end"/>
+      </w:r>
+      <w:r>
+        <w:rPr>
+          <w:rFonts w:hint="eastAsia"/>
+        </w:rPr>
+        <w:t>应用宣传海报</w:t>
+      </w:r>
+      <w:r>
+        <w:rPr>
+          <w:rFonts w:hint="eastAsia"/>
+        </w:rPr>
+        <w:t>-2</w:t>
+      </w:r>
+    </w:p>
+    <w:p>
+      <w:pPr>
+        <w:keepNext/>
+        <w:widowControl/>
+        <w:ind w:firstLine="420"/>
+        <w:jc w:val="left"/>
+        <w:rPr>
+          <w:rFonts w:hint="eastAsia"/>
+        </w:rPr>
+      </w:pPr>
+      <w:r>
+        <w:rPr>
+          <w:rFonts w:ascii="宋体" w:eastAsia="宋体" w:hAnsi="宋体" w:cs="宋体" w:hint="eastAsia"/>
+          <w:noProof/>
+          <w:szCs w:val="21"/>
+          <w:lang w:eastAsia="zh"/>
+        </w:rPr>
+        <w:lastRenderedPageBreak/>
+        <w:drawing>
+          <wp:inline distT="0" distB="0" distL="114300" distR="114300" wp14:anchorId="3A43DB96" wp14:editId="18E1418A">
+            <wp:extent cx="5270093" cy="7454632"/>
+            <wp:effectExtent l="0" t="0" r="6985" b="0"/>
+            <wp:docPr id="13" name="图片 13"/>
+            <wp:cNvGraphicFramePr>
+              <a:graphicFrameLocks xmlns:a="http://schemas.openxmlformats.org/drawingml/2006/main" noChangeAspect="1"/>
+            </wp:cNvGraphicFramePr>
+            <a:graphic xmlns:a="http://schemas.openxmlformats.org/drawingml/2006/main">
+              <a:graphicData uri="http://schemas.openxmlformats.org/drawingml/2006/picture">
+                <pic:pic xmlns:pic="http://schemas.openxmlformats.org/drawingml/2006/picture">
+                  <pic:nvPicPr>
+                    <pic:cNvPr id="13" name="图片 13"/>
+                    <pic:cNvPicPr>
+                      <a:picLocks noChangeAspect="1"/>
+                    </pic:cNvPicPr>
+                  </pic:nvPicPr>
+                  <pic:blipFill>
+                    <a:blip r:embed="rId15"/>
                     <a:stretch>
                       <a:fillRect/>
                     </a:stretch>
@@ -2856,51 +3324,83 @@
           </wp:inline>
         </w:drawing>
       </w:r>
-      <w:r>
-        <w:rPr>
-          <w:rFonts w:ascii="宋体" w:eastAsia="宋体" w:hAnsi="宋体" w:cs="宋体" w:hint="eastAsia"/>
+    </w:p>
+    <w:p>
+      <w:pPr>
+        <w:pStyle w:val="ac"/>
+        <w:jc w:val="center"/>
+        <w:rPr>
+          <w:rFonts w:ascii="宋体" w:hAnsi="宋体" w:cs="宋体" w:hint="eastAsia"/>
+          <w:szCs w:val="21"/>
+          <w:lang w:eastAsia="zh"/>
+        </w:rPr>
+      </w:pPr>
+      <w:r>
+        <w:rPr>
+          <w:rFonts w:hint="eastAsia"/>
+        </w:rPr>
+        <w:t>图</w:t>
+      </w:r>
+      <w:r>
+        <w:rPr>
+          <w:rFonts w:hint="eastAsia"/>
+        </w:rPr>
+        <w:t xml:space="preserve"> </w:t>
+      </w:r>
+      <w:r>
+        <w:rPr>
+          <w:rFonts w:hint="eastAsia"/>
+        </w:rPr>
+        <w:fldChar w:fldCharType="begin"/>
+      </w:r>
+      <w:r>
+        <w:rPr>
+          <w:rFonts w:hint="eastAsia"/>
+        </w:rPr>
+        <w:instrText xml:space="preserve"> SEQ </w:instrText>
+      </w:r>
+      <w:r>
+        <w:rPr>
+          <w:rFonts w:hint="eastAsia"/>
+        </w:rPr>
+        <w:instrText>图</w:instrText>
+      </w:r>
+      <w:r>
+        <w:rPr>
+          <w:rFonts w:hint="eastAsia"/>
+        </w:rPr>
+        <w:instrText xml:space="preserve"> \* ARABIC </w:instrText>
+      </w:r>
+      <w:r>
+        <w:rPr>
+          <w:rFonts w:hint="eastAsia"/>
+        </w:rPr>
+        <w:fldChar w:fldCharType="separate"/>
+      </w:r>
+      <w:r>
+        <w:rPr>
+          <w:rFonts w:hint="eastAsia"/>
           <w:noProof/>
-          <w:szCs w:val="21"/>
-          <w:lang w:eastAsia="zh"/>
-        </w:rPr>
-        <w:lastRenderedPageBreak/>
-        <w:drawing>
-          <wp:inline distT="0" distB="0" distL="114300" distR="114300" wp14:anchorId="3A43DB96" wp14:editId="14251739">
-            <wp:extent cx="5270093" cy="7454632"/>
-            <wp:effectExtent l="0" t="0" r="6985" b="0"/>
-            <wp:docPr id="13" name="图片 13"/>
-            <wp:cNvGraphicFramePr>
-              <a:graphicFrameLocks xmlns:a="http://schemas.openxmlformats.org/drawingml/2006/main" noChangeAspect="1"/>
-            </wp:cNvGraphicFramePr>
-            <a:graphic xmlns:a="http://schemas.openxmlformats.org/drawingml/2006/main">
-              <a:graphicData uri="http://schemas.openxmlformats.org/drawingml/2006/picture">
-                <pic:pic xmlns:pic="http://schemas.openxmlformats.org/drawingml/2006/picture">
-                  <pic:nvPicPr>
-                    <pic:cNvPr id="13" name="图片 13"/>
-                    <pic:cNvPicPr>
-                      <a:picLocks noChangeAspect="1"/>
-                    </pic:cNvPicPr>
-                  </pic:nvPicPr>
-                  <pic:blipFill>
-                    <a:blip r:embed="rId11"/>
-                    <a:stretch>
-                      <a:fillRect/>
-                    </a:stretch>
-                  </pic:blipFill>
-                  <pic:spPr>
-                    <a:xfrm>
-                      <a:off x="0" y="0"/>
-                      <a:ext cx="5270093" cy="7454632"/>
-                    </a:xfrm>
-                    <a:prstGeom prst="rect">
-                      <a:avLst/>
-                    </a:prstGeom>
-                  </pic:spPr>
-                </pic:pic>
-              </a:graphicData>
-            </a:graphic>
-          </wp:inline>
-        </w:drawing>
+        </w:rPr>
+        <w:t>4</w:t>
+      </w:r>
+      <w:r>
+        <w:rPr>
+          <w:rFonts w:hint="eastAsia"/>
+        </w:rPr>
+        <w:fldChar w:fldCharType="end"/>
+      </w:r>
+      <w:r>
+        <w:rPr>
+          <w:rFonts w:hint="eastAsia"/>
+        </w:rPr>
+        <w:t>应用宣传海报</w:t>
+      </w:r>
+      <w:r>
+        <w:rPr>
+          <w:rFonts w:hint="eastAsia"/>
+        </w:rPr>
+        <w:t>-3</w:t>
       </w:r>
     </w:p>
     <w:p>
@@ -2945,7 +3445,25 @@
           <w:szCs w:val="24"/>
         </w:rPr>
         <w:lastRenderedPageBreak/>
-        <w:t>（4）核心界面展示</w:t>
+        <w:t>（</w:t>
+      </w:r>
+      <w:r>
+        <w:rPr>
+          <w:rFonts w:ascii="宋体" w:eastAsia="宋体" w:hAnsi="宋体" w:hint="eastAsia"/>
+          <w:b/>
+          <w:sz w:val="24"/>
+          <w:szCs w:val="24"/>
+        </w:rPr>
+        <w:t>3</w:t>
+      </w:r>
+      <w:r>
+        <w:rPr>
+          <w:rFonts w:ascii="宋体" w:eastAsia="宋体" w:hAnsi="宋体" w:hint="eastAsia"/>
+          <w:b/>
+          <w:sz w:val="24"/>
+          <w:szCs w:val="24"/>
+        </w:rPr>
+        <w:t>）核心界面展示</w:t>
       </w:r>
     </w:p>
     <w:p>
@@ -3004,7 +3522,7 @@
                     </pic:cNvPicPr>
                   </pic:nvPicPr>
                   <pic:blipFill>
-                    <a:blip r:embed="rId12"/>
+                    <a:blip r:embed="rId16"/>
                     <a:stretch>
                       <a:fillRect/>
                     </a:stretch>
@@ -3382,13 +3900,33 @@
           <w:szCs w:val="21"/>
           <w:lang w:eastAsia="zh"/>
         </w:rPr>
-      </w:pPr>
-      <w:r>
-        <w:rPr>
-          <w:rFonts w:ascii="宋体" w:eastAsia="宋体" w:hAnsi="宋体" w:cs="宋体" w:hint="eastAsia"/>
-          <w:szCs w:val="21"/>
-          <w:lang w:eastAsia="zh"/>
-        </w:rPr>
+        <w:sectPr>
+          <w:footerReference w:type="default" r:id="rId17"/>
+          <w:pgSz w:w="11900" w:h="16840"/>
+          <w:pgMar w:top="1440" w:right="1800" w:bottom="1440" w:left="1800" w:header="851" w:footer="850" w:gutter="0"/>
+          <w:cols w:space="425"/>
+          <w:docGrid w:type="lines" w:linePitch="312"/>
+        </w:sectPr>
+      </w:pPr>
+    </w:p>
+    <w:p>
+      <w:pPr>
+        <w:widowControl/>
+        <w:ind w:firstLine="420"/>
+        <w:jc w:val="left"/>
+        <w:rPr>
+          <w:rFonts w:ascii="宋体" w:eastAsia="宋体" w:hAnsi="宋体" w:cs="宋体" w:hint="eastAsia"/>
+          <w:szCs w:val="21"/>
+          <w:lang w:eastAsia="zh"/>
+        </w:rPr>
+      </w:pPr>
+      <w:r>
+        <w:rPr>
+          <w:rFonts w:ascii="宋体" w:eastAsia="宋体" w:hAnsi="宋体" w:cs="宋体" w:hint="eastAsia"/>
+          <w:szCs w:val="21"/>
+          <w:lang w:eastAsia="zh"/>
+        </w:rPr>
+        <w:lastRenderedPageBreak/>
         <w:t>4.2 运动播放界面</w:t>
       </w:r>
     </w:p>
@@ -3410,7 +3948,6 @@
           <w:szCs w:val="21"/>
           <w:lang w:eastAsia="zh"/>
         </w:rPr>
-        <w:lastRenderedPageBreak/>
         <w:drawing>
           <wp:inline distT="0" distB="0" distL="114300" distR="114300" wp14:anchorId="1E98D424" wp14:editId="780E8C52">
             <wp:extent cx="1036597" cy="2242820"/>
@@ -3429,7 +3966,7 @@
                     </pic:cNvPicPr>
                   </pic:nvPicPr>
                   <pic:blipFill>
-                    <a:blip r:embed="rId13"/>
+                    <a:blip r:embed="rId18"/>
                     <a:stretch>
                       <a:fillRect/>
                     </a:stretch>
@@ -3904,7 +4441,7 @@
                     </pic:cNvPicPr>
                   </pic:nvPicPr>
                   <pic:blipFill>
-                    <a:blip r:embed="rId14"/>
+                    <a:blip r:embed="rId19"/>
                     <a:stretch>
                       <a:fillRect/>
                     </a:stretch>
@@ -4180,15 +4717,32 @@
           <w:szCs w:val="21"/>
           <w:lang w:eastAsia="zh"/>
         </w:rPr>
-      </w:pPr>
-      <w:r>
-        <w:rPr>
-          <w:rFonts w:ascii="宋体" w:eastAsia="宋体" w:hAnsi="宋体" w:cs="宋体" w:hint="eastAsia"/>
-          <w:szCs w:val="21"/>
-          <w:lang w:eastAsia="zh"/>
-        </w:rPr>
-        <w:t>排序调整：长按歌曲并上下拖动，即可自由改变该歌曲在当前播放列表中的排列顺序。</w:t>
-      </w:r>
+        <w:sectPr>
+          <w:pgSz w:w="11900" w:h="16840"/>
+          <w:pgMar w:top="1440" w:right="1800" w:bottom="1440" w:left="1800" w:header="851" w:footer="850" w:gutter="0"/>
+          <w:cols w:space="425"/>
+          <w:docGrid w:type="lines" w:linePitch="312"/>
+        </w:sectPr>
+      </w:pPr>
+      <w:r>
+        <w:rPr>
+          <w:rFonts w:ascii="宋体" w:eastAsia="宋体" w:hAnsi="宋体" w:cs="宋体" w:hint="eastAsia"/>
+          <w:szCs w:val="21"/>
+          <w:lang w:eastAsia="zh"/>
+        </w:rPr>
+        <w:t>排序调整：长按歌曲并上下拖动，即可自由改变该歌曲在当前播放列表中的排列顺序</w:t>
+      </w:r>
+    </w:p>
+    <w:p>
+      <w:pPr>
+        <w:widowControl/>
+        <w:jc w:val="left"/>
+        <w:rPr>
+          <w:rFonts w:ascii="宋体" w:eastAsia="宋体" w:hAnsi="宋体" w:cs="宋体" w:hint="eastAsia"/>
+          <w:szCs w:val="21"/>
+          <w:lang w:eastAsia="zh"/>
+        </w:rPr>
+      </w:pPr>
     </w:p>
     <w:p>
       <w:pPr>
@@ -4246,7 +4800,7 @@
                     </pic:cNvPicPr>
                   </pic:nvPicPr>
                   <pic:blipFill>
-                    <a:blip r:embed="rId15"/>
+                    <a:blip r:embed="rId20"/>
                     <a:stretch>
                       <a:fillRect/>
                     </a:stretch>
@@ -4308,7 +4862,6 @@
           <w:szCs w:val="21"/>
           <w:lang w:eastAsia="zh"/>
         </w:rPr>
-        <w:lastRenderedPageBreak/>
         <w:t>界面整体功能</w:t>
       </w:r>
       <w:r>
@@ -4651,15 +5204,32 @@
           <w:szCs w:val="21"/>
           <w:lang w:eastAsia="zh"/>
         </w:rPr>
-      </w:pPr>
-      <w:r>
-        <w:rPr>
-          <w:rFonts w:ascii="宋体" w:eastAsia="宋体" w:hAnsi="宋体" w:cs="宋体" w:hint="eastAsia"/>
-          <w:szCs w:val="21"/>
-          <w:lang w:eastAsia="zh"/>
-        </w:rPr>
-        <w:t>清空曲线：点击“清空曲线”按钮，即可一键清除当前绘图区内已绘制的所有曲线。</w:t>
-      </w:r>
+        <w:sectPr>
+          <w:pgSz w:w="11900" w:h="16840"/>
+          <w:pgMar w:top="1440" w:right="1800" w:bottom="1440" w:left="1800" w:header="851" w:footer="850" w:gutter="0"/>
+          <w:cols w:space="425"/>
+          <w:docGrid w:type="lines" w:linePitch="312"/>
+        </w:sectPr>
+      </w:pPr>
+      <w:r>
+        <w:rPr>
+          <w:rFonts w:ascii="宋体" w:eastAsia="宋体" w:hAnsi="宋体" w:cs="宋体" w:hint="eastAsia"/>
+          <w:szCs w:val="21"/>
+          <w:lang w:eastAsia="zh"/>
+        </w:rPr>
+        <w:t>清空曲线：点击“清空曲线”按钮，即可一键清除当前绘图区内已绘制的所有曲线</w:t>
+      </w:r>
+    </w:p>
+    <w:p>
+      <w:pPr>
+        <w:widowControl/>
+        <w:jc w:val="left"/>
+        <w:rPr>
+          <w:rFonts w:ascii="宋体" w:eastAsia="宋体" w:hAnsi="宋体" w:cs="宋体" w:hint="eastAsia"/>
+          <w:szCs w:val="21"/>
+          <w:lang w:eastAsia="zh"/>
+        </w:rPr>
+      </w:pPr>
     </w:p>
     <w:p>
       <w:pPr>
@@ -4717,7 +5287,7 @@
                     </pic:cNvPicPr>
                   </pic:nvPicPr>
                   <pic:blipFill>
-                    <a:blip r:embed="rId16"/>
+                    <a:blip r:embed="rId21"/>
                     <a:stretch>
                       <a:fillRect/>
                     </a:stretch>
@@ -4875,7 +5445,6 @@
           <w:szCs w:val="21"/>
           <w:lang w:eastAsia="zh"/>
         </w:rPr>
-        <w:lastRenderedPageBreak/>
         <w:t>基础交互：列表的选择交互逻辑与“播放列表界面”保持一致。</w:t>
       </w:r>
     </w:p>
@@ -4969,15 +5538,32 @@
           <w:szCs w:val="21"/>
           <w:lang w:eastAsia="zh"/>
         </w:rPr>
-      </w:pPr>
-      <w:r>
-        <w:rPr>
-          <w:rFonts w:ascii="宋体" w:eastAsia="宋体" w:hAnsi="宋体" w:cs="宋体" w:hint="eastAsia"/>
-          <w:szCs w:val="21"/>
-          <w:lang w:eastAsia="zh"/>
-        </w:rPr>
-        <w:t>编辑功能：点击曲线右下方的“编辑”按钮，可直接跳转至“曲线编辑界面”对该曲线进行二次修改。</w:t>
-      </w:r>
+        <w:sectPr>
+          <w:pgSz w:w="11900" w:h="16840"/>
+          <w:pgMar w:top="1440" w:right="1800" w:bottom="1440" w:left="1800" w:header="851" w:footer="850" w:gutter="0"/>
+          <w:cols w:space="425"/>
+          <w:docGrid w:type="lines" w:linePitch="312"/>
+        </w:sectPr>
+      </w:pPr>
+      <w:r>
+        <w:rPr>
+          <w:rFonts w:ascii="宋体" w:eastAsia="宋体" w:hAnsi="宋体" w:cs="宋体" w:hint="eastAsia"/>
+          <w:szCs w:val="21"/>
+          <w:lang w:eastAsia="zh"/>
+        </w:rPr>
+        <w:t>编辑功能：点击曲线右下方的“编辑”按钮，可直接跳转至“曲线编辑界面”对该曲线进行二次修改</w:t>
+      </w:r>
+    </w:p>
+    <w:p>
+      <w:pPr>
+        <w:widowControl/>
+        <w:jc w:val="left"/>
+        <w:rPr>
+          <w:rFonts w:ascii="宋体" w:eastAsia="宋体" w:hAnsi="宋体" w:cs="宋体" w:hint="eastAsia"/>
+          <w:szCs w:val="21"/>
+          <w:lang w:eastAsia="zh"/>
+        </w:rPr>
+      </w:pPr>
     </w:p>
     <w:p>
       <w:pPr>
@@ -5035,7 +5621,7 @@
                     </pic:cNvPicPr>
                   </pic:nvPicPr>
                   <pic:blipFill>
-                    <a:blip r:embed="rId17"/>
+                    <a:blip r:embed="rId22"/>
                     <a:stretch>
                       <a:fillRect/>
                     </a:stretch>
@@ -5433,7 +6019,6 @@
           <w:rFonts w:ascii="宋体" w:eastAsia="宋体" w:hAnsi="宋体" w:cs="宋体" w:hint="eastAsia"/>
           <w:szCs w:val="21"/>
         </w:rPr>
-        <w:lastRenderedPageBreak/>
         <w:t>·</w:t>
       </w:r>
       <w:r>
@@ -5448,6 +6033,36 @@
       <w:pPr>
         <w:widowControl/>
         <w:ind w:firstLine="420"/>
+        <w:jc w:val="left"/>
+        <w:rPr>
+          <w:rFonts w:ascii="宋体" w:eastAsia="宋体" w:hAnsi="宋体" w:cs="宋体" w:hint="eastAsia"/>
+          <w:szCs w:val="21"/>
+        </w:rPr>
+        <w:sectPr>
+          <w:pgSz w:w="11900" w:h="16840"/>
+          <w:pgMar w:top="1440" w:right="1800" w:bottom="1440" w:left="1800" w:header="851" w:footer="850" w:gutter="0"/>
+          <w:cols w:space="425"/>
+          <w:docGrid w:type="lines" w:linePitch="312"/>
+        </w:sectPr>
+      </w:pPr>
+      <w:r>
+        <w:rPr>
+          <w:rFonts w:ascii="宋体" w:eastAsia="宋体" w:hAnsi="宋体" w:cs="宋体" w:hint="eastAsia"/>
+          <w:szCs w:val="21"/>
+        </w:rPr>
+        <w:t>·</w:t>
+      </w:r>
+      <w:r>
+        <w:rPr>
+          <w:rFonts w:ascii="宋体" w:eastAsia="宋体" w:hAnsi="宋体" w:cs="宋体"/>
+          <w:szCs w:val="21"/>
+        </w:rPr>
+        <w:t>实现音乐节奏与人体跑步步伐的高度契合，大幅提升跑步运动的沉浸感与运动训练效率。</w:t>
+      </w:r>
+    </w:p>
+    <w:p>
+      <w:pPr>
+        <w:widowControl/>
         <w:jc w:val="left"/>
         <w:rPr>
           <w:rFonts w:ascii="宋体" w:eastAsia="宋体" w:hAnsi="宋体" w:cs="宋体" w:hint="eastAsia"/>
@@ -5455,20 +6070,6 @@
           <w:szCs w:val="24"/>
         </w:rPr>
       </w:pPr>
-      <w:r>
-        <w:rPr>
-          <w:rFonts w:ascii="宋体" w:eastAsia="宋体" w:hAnsi="宋体" w:cs="宋体" w:hint="eastAsia"/>
-          <w:szCs w:val="21"/>
-        </w:rPr>
-        <w:t>·</w:t>
-      </w:r>
-      <w:r>
-        <w:rPr>
-          <w:rFonts w:ascii="宋体" w:eastAsia="宋体" w:hAnsi="宋体" w:cs="宋体"/>
-          <w:szCs w:val="21"/>
-        </w:rPr>
-        <w:t>实现音乐节奏与人体跑步步伐的高度契合，大幅提升跑步运动的沉浸感与运动训练效率。</w:t>
-      </w:r>
     </w:p>
     <w:p>
       <w:pPr>
@@ -5903,7 +6504,23 @@
           <w:rFonts w:ascii="宋体" w:eastAsia="宋体" w:hAnsi="宋体" w:hint="eastAsia"/>
           <w:szCs w:val="21"/>
         </w:rPr>
-        <w:t xml:space="preserve"> 解码、Essentia 节拍分析与 Signalsmith Stretch 变速引擎构成；应用交互层负责模式切换、曲线编辑与数据可视化。</w:t>
+        <w:t xml:space="preserve"> 解码、Essentia 节拍分析与 </w:t>
+      </w:r>
+      <w:proofErr w:type="spellStart"/>
+      <w:r>
+        <w:rPr>
+          <w:rFonts w:ascii="宋体" w:eastAsia="宋体" w:hAnsi="宋体" w:hint="eastAsia"/>
+          <w:szCs w:val="21"/>
+        </w:rPr>
+        <w:t>Signalsmith</w:t>
+      </w:r>
+      <w:proofErr w:type="spellEnd"/>
+      <w:r>
+        <w:rPr>
+          <w:rFonts w:ascii="宋体" w:eastAsia="宋体" w:hAnsi="宋体" w:hint="eastAsia"/>
+          <w:szCs w:val="21"/>
+        </w:rPr>
+        <w:t xml:space="preserve"> Stretch 变速引擎构成；应用交互层负责模式切换、曲线编辑与数据可视化。</w:t>
       </w:r>
     </w:p>
     <w:p>
@@ -5955,15 +6572,7 @@
           <w:rFonts w:ascii="宋体" w:eastAsia="宋体" w:hAnsi="宋体" w:hint="eastAsia"/>
           <w:szCs w:val="21"/>
         </w:rPr>
-        <w:t xml:space="preserve"> 状态机（ADJUST→CHASE→HOLD）闭环跟踪，适合自由跑；恒定 BPM：以规定步频为目标，开环控制、结构简单；步频曲线：用户绘制“热身—目标—放松”的阶梯曲线，暂停时曲线时间</w:t>
-      </w:r>
-      <w:r>
-        <w:rPr>
-          <w:rFonts w:ascii="宋体" w:eastAsia="宋体" w:hAnsi="宋体" w:hint="eastAsia"/>
-          <w:szCs w:val="21"/>
-        </w:rPr>
-        <w:lastRenderedPageBreak/>
-        <w:t>轴自动冻结，恢复后相位不跳变。</w:t>
+        <w:t xml:space="preserve"> 状态机（ADJUST→CHASE→HOLD）闭环跟踪，适合自由跑；恒定 BPM：以规定步频为目标，开环控制、结构简单；步频曲线：用户绘制“热身—目标—放松”的阶梯曲线，暂停时曲线时间轴自动冻结，恢复后相位不跳变。</w:t>
       </w:r>
     </w:p>
     <w:p>
@@ -5981,7 +6590,15 @@
           <w:rFonts w:ascii="宋体" w:eastAsia="宋体" w:hAnsi="宋体" w:hint="eastAsia"/>
           <w:szCs w:val="21"/>
         </w:rPr>
-        <w:t xml:space="preserve">④ 工程实现与验证。核心算法以 C++11 纯头文件、零依赖方式交付，并通过 NAPI 桥接 </w:t>
+        <w:t>④ 工程实现与验证。核心算法以 C++11 纯头文件、零依赖方式交付，并通过 NAPI 桥</w:t>
+      </w:r>
+      <w:r>
+        <w:rPr>
+          <w:rFonts w:ascii="宋体" w:eastAsia="宋体" w:hAnsi="宋体" w:hint="eastAsia"/>
+          <w:szCs w:val="21"/>
+        </w:rPr>
+        <w:lastRenderedPageBreak/>
+        <w:t xml:space="preserve">接 </w:t>
       </w:r>
       <w:proofErr w:type="spellStart"/>
       <w:r>
@@ -6094,7 +6711,7 @@
         <w:snapToGrid w:val="0"/>
         <w:ind w:firstLineChars="200" w:firstLine="420"/>
         <w:rPr>
-          <w:rFonts w:ascii="宋体" w:eastAsia="宋体" w:hAnsi="宋体"/>
+          <w:rFonts w:ascii="宋体" w:eastAsia="宋体" w:hAnsi="宋体" w:hint="eastAsia"/>
           <w:szCs w:val="21"/>
         </w:rPr>
       </w:pPr>
@@ -6125,25 +6742,7 @@
           <w:sz w:val="24"/>
           <w:szCs w:val="24"/>
         </w:rPr>
-        <w:t>（</w:t>
-      </w:r>
-      <w:r>
-        <w:rPr>
-          <w:rFonts w:ascii="宋体" w:eastAsia="宋体" w:hAnsi="宋体" w:hint="eastAsia"/>
-          <w:b/>
-          <w:sz w:val="24"/>
-          <w:szCs w:val="24"/>
-        </w:rPr>
-        <w:t>4</w:t>
-      </w:r>
-      <w:r>
-        <w:rPr>
-          <w:rFonts w:ascii="宋体" w:eastAsia="宋体" w:hAnsi="宋体" w:hint="eastAsia"/>
-          <w:b/>
-          <w:sz w:val="24"/>
-          <w:szCs w:val="24"/>
-        </w:rPr>
-        <w:t>）系统技术架构</w:t>
+        <w:t>（4）系统技术架构</w:t>
       </w:r>
     </w:p>
     <w:p>
@@ -7086,7 +7685,6 @@
       </w:r>
     </w:p>
     <w:sectPr>
-      <w:footerReference w:type="default" r:id="rId18"/>
       <w:pgSz w:w="11900" w:h="16840"/>
       <w:pgMar w:top="1440" w:right="1800" w:bottom="1440" w:left="1800" w:header="851" w:footer="850" w:gutter="0"/>
       <w:cols w:space="425"/>
@@ -8273,10 +8871,9 @@
     <w:uiPriority w:val="35"/>
     <w:unhideWhenUsed/>
     <w:qFormat/>
-    <w:rsid w:val="00692487"/>
+    <w:rsid w:val="00D16EC7"/>
     <w:rPr>
-      <w:rFonts w:asciiTheme="majorHAnsi" w:eastAsia="黑体" w:hAnsiTheme="majorHAnsi" w:cstheme="majorBidi"/>
-      <w:sz w:val="20"/>
+      <w:rFonts w:ascii="Times New Roman" w:eastAsia="宋体" w:hAnsi="Times New Roman" w:cstheme="majorBidi"/>
       <w:szCs w:val="20"/>
     </w:rPr>
   </w:style>

</xml_diff>